<commit_message>
docs: VKR progress in WORKLOG and vkr draft files
Co-authored-by: Cursor <cursoragent@cursor.com>
</commit_message>
<xml_diff>
--- a/reports/vkr/структура ВКР.docx
+++ b/reports/vkr/структура ВКР.docx
@@ -4,47 +4,36 @@
   <w:body>
     <w:p>
       <w:r>
-        <w:t>Титульный лист</w:t>
+        <w:t>ВВЕДЕНИЕ</w:t>
+      </w:r>
+    </w:p>
+    <w:p/>
+    <w:p>
+      <w:r>
+        <w:t>1 АНАЛИЗ ПРЕДМЕТНОЙ ОБЛАСТИ И СУЩЕСТВУЮЩИХ РЕШЕНИЙ</w:t>
       </w:r>
     </w:p>
     <w:p>
       <w:r>
-        <w:t>Задание на ВКР (отдельный документ, не вшивается в текст)</w:t>
+        <w:t>1.1 Описание предметной области</w:t>
       </w:r>
     </w:p>
     <w:p>
       <w:r>
-        <w:t>Оглавление</w:t>
+        <w:t>1.2 Административные процессы и роли пользователей</w:t>
       </w:r>
     </w:p>
     <w:p>
       <w:r>
-        <w:t>ВВЕДЕНИЕ</w:t>
+        <w:t>1.3 Анализ существующих решений</w:t>
       </w:r>
     </w:p>
     <w:p>
       <w:r>
-        <w:t>1 АНАЛИЗ ИНФОРМАЦИОННЫХ ПРОЦЕССОВ...</w:t>
+        <w:t>1.4 Формирование требований к системе</w:t>
       </w:r>
     </w:p>
-    <w:p>
-      <w:r>
-        <w:t xml:space="preserve">   1.1 Общая характеристика...</w:t>
-      </w:r>
-    </w:p>
-    <w:p>
-      <w:r>
-        <w:t xml:space="preserve">   1.2 Анализ существующих бизнес-процессов...</w:t>
-      </w:r>
-    </w:p>
-    <w:p>
-      <w:r>
-        <w:t xml:space="preserve">   1.3 Обзор существующих информационных систем</w:t>
-      </w:r>
-      <w:r>
-        <w:t xml:space="preserve"> (сравнительный анализ)</w:t>
-      </w:r>
-    </w:p>
+    <w:p/>
     <w:p>
       <w:r>
         <w:t>2 ПРОЕКТИРОВАНИЕ ИНФОРМАЦИОННОЙ СИСТЕМЫ</w:t>
@@ -52,201 +41,99 @@
     </w:p>
     <w:p>
       <w:r>
-        <w:t xml:space="preserve">   2.1 Требования к информационной системе</w:t>
+        <w:t xml:space="preserve">2.1 </w:t>
+      </w:r>
+      <w:bookmarkStart w:id="0" w:name="_Hlk230205972"/>
+      <w:r>
+        <w:t>Обоснование выбора технологического стека</w:t>
+      </w:r>
+      <w:bookmarkEnd w:id="0"/>
+    </w:p>
+    <w:p>
+      <w:r>
+        <w:t>2.2 Функциональная декомпозиция и UML-диаграммы</w:t>
       </w:r>
     </w:p>
     <w:p>
       <w:r>
-        <w:t xml:space="preserve">   2.2 Средства и инструменты реализации</w:t>
+        <w:t>2.3 Архитектура системы</w:t>
       </w:r>
     </w:p>
     <w:p>
       <w:r>
-        <w:t xml:space="preserve">   2.3 Моделирование структуры данных</w:t>
+        <w:t>2.4 Проектирование базы данных</w:t>
       </w:r>
     </w:p>
     <w:p>
       <w:r>
-        <w:t xml:space="preserve">   2.4 Проектирование пользовательских интерфейсов</w:t>
+        <w:t xml:space="preserve">2.5 </w:t>
+      </w:r>
+      <w:bookmarkStart w:id="1" w:name="_Hlk230209452"/>
+      <w:r>
+        <w:t>Ролевая модель и безопасность</w:t>
+      </w:r>
+      <w:bookmarkEnd w:id="1"/>
+    </w:p>
+    <w:p>
+      <w:r>
+        <w:t>2.6 Проектирование пользовательских интерфейсов</w:t>
       </w:r>
     </w:p>
+    <w:p/>
     <w:p>
-      <w:pPr>
-        <w:rPr>
-          <w:highlight w:val="yellow"/>
-        </w:rPr>
-      </w:pPr>
       <w:r>
-        <w:rPr>
-          <w:highlight w:val="yellow"/>
-        </w:rPr>
-        <w:t>3 РЕАЛИЗАЦИЯ ИНФОРМАЦИОННОЙ СИСТЕМЫ</w:t>
-      </w:r>
-    </w:p>
-    <w:p>
-      <w:pPr>
-        <w:rPr>
-          <w:highlight w:val="yellow"/>
-        </w:rPr>
-      </w:pPr>
-      <w:r>
-        <w:rPr>
-          <w:highlight w:val="yellow"/>
-        </w:rPr>
-        <w:t xml:space="preserve">   3.1 Структура проекта и модели данных</w:t>
-      </w:r>
-    </w:p>
-    <w:p>
-      <w:pPr>
-        <w:rPr>
-          <w:highlight w:val="yellow"/>
-        </w:rPr>
-      </w:pPr>
-      <w:r>
-        <w:rPr>
-          <w:highlight w:val="yellow"/>
-        </w:rPr>
-        <w:t xml:space="preserve">   3.2 Реализация ключевых бизнес-сценариев</w:t>
-      </w:r>
-    </w:p>
-    <w:p>
-      <w:pPr>
-        <w:rPr>
-          <w:highlight w:val="yellow"/>
-        </w:rPr>
-      </w:pPr>
-      <w:r>
-        <w:rPr>
-          <w:highlight w:val="yellow"/>
-        </w:rPr>
-        <w:t xml:space="preserve">   3.3 Пользовательские интерфейсы и администрирование</w:t>
-      </w:r>
-    </w:p>
-    <w:p>
-      <w:pPr>
-        <w:rPr>
-          <w:highlight w:val="yellow"/>
-        </w:rPr>
-      </w:pPr>
-      <w:r>
-        <w:rPr>
-          <w:highlight w:val="yellow"/>
-        </w:rPr>
-        <w:t>Глава 4. ТЕСТИРОВАНИЕ ИНФОРМАЦИОННОЙ СИСТЕМЫ</w:t>
-      </w:r>
-    </w:p>
-    <w:p>
-      <w:pPr>
-        <w:rPr>
-          <w:highlight w:val="yellow"/>
-        </w:rPr>
-      </w:pPr>
-      <w:r>
-        <w:rPr>
-          <w:highlight w:val="yellow"/>
-        </w:rPr>
-        <w:t xml:space="preserve">   4.1 План тестирования</w:t>
-      </w:r>
-    </w:p>
-    <w:p>
-      <w:pPr>
-        <w:rPr>
-          <w:highlight w:val="yellow"/>
-        </w:rPr>
-      </w:pPr>
-      <w:r>
-        <w:rPr>
-          <w:highlight w:val="yellow"/>
-        </w:rPr>
-        <w:t xml:space="preserve">   4.2 Результаты тестирования</w:t>
-      </w:r>
-    </w:p>
-    <w:p>
-      <w:pPr>
-        <w:rPr>
-          <w:highlight w:val="yellow"/>
-        </w:rPr>
-      </w:pPr>
-      <w:r>
-        <w:rPr>
-          <w:highlight w:val="yellow"/>
-        </w:rPr>
-        <w:t>Глава 5. РАЗВЁРТЫВАНИЕ ИНФОРМАЦИОННОЙ СИСТЕМЫ</w:t>
-      </w:r>
-    </w:p>
-    <w:p>
-      <w:pPr>
-        <w:rPr>
-          <w:highlight w:val="yellow"/>
-        </w:rPr>
-      </w:pPr>
-      <w:r>
-        <w:rPr>
-          <w:highlight w:val="yellow"/>
-        </w:rPr>
-        <w:t xml:space="preserve">   5.1 Требования к аппаратному и программному обеспечению</w:t>
-      </w:r>
-    </w:p>
-    <w:p>
-      <w:pPr>
-        <w:rPr>
-          <w:highlight w:val="yellow"/>
-        </w:rPr>
-      </w:pPr>
-      <w:r>
-        <w:rPr>
-          <w:highlight w:val="yellow"/>
-        </w:rPr>
-        <w:t xml:space="preserve">   5.2 Установка и настройка (Docker / ручная)</w:t>
+        <w:t>3 РЕАЛИЗАЦИЯ И АПРОБАЦИЯ ИНФОРМАЦИОННОЙ СИСТЕМЫ</w:t>
       </w:r>
     </w:p>
     <w:p>
       <w:r>
-        <w:rPr>
-          <w:highlight w:val="yellow"/>
-        </w:rPr>
-        <w:t xml:space="preserve">   5.3 Конфигурация веб-сервера</w:t>
+        <w:t xml:space="preserve">3.1 </w:t>
+      </w:r>
+      <w:bookmarkStart w:id="2" w:name="_Hlk230209981"/>
+      <w:r>
+        <w:t>Организация процесса разработки</w:t>
+      </w:r>
+    </w:p>
+    <w:bookmarkEnd w:id="2"/>
+    <w:p>
+      <w:r>
+        <w:t xml:space="preserve">3.2 </w:t>
+      </w:r>
+      <w:bookmarkStart w:id="3" w:name="_Hlk230210206"/>
+      <w:r>
+        <w:t>Реализация серверной части</w:t>
+      </w:r>
+      <w:bookmarkEnd w:id="3"/>
+    </w:p>
+    <w:p>
+      <w:r>
+        <w:t>3.3 Реализация клиентской части</w:t>
       </w:r>
     </w:p>
     <w:p>
       <w:r>
-        <w:t xml:space="preserve">   </w:t>
-      </w:r>
-      <w:r>
-        <w:rPr>
-          <w:highlight w:val="yellow"/>
-        </w:rPr>
-        <w:t>5.4 Запуск и первоначальная настройка</w:t>
+        <w:t>3.4 Реализация бизнес-логики</w:t>
       </w:r>
     </w:p>
     <w:p>
       <w:r>
-        <w:t>Опробирование?</w:t>
+        <w:t>3.5 Реализация ролевой модели</w:t>
       </w:r>
     </w:p>
     <w:p>
       <w:r>
-        <w:t>ЗАКЛЮЧЕНИЕ</w:t>
+        <w:t>3.6 Проверка работоспособности системы</w:t>
       </w:r>
     </w:p>
     <w:p>
       <w:r>
-        <w:t>СПИСОК ЛИТЕРАТУРЫ</w:t>
+        <w:t>3.7 Итоги реализации и ограничения</w:t>
       </w:r>
     </w:p>
+    <w:p/>
     <w:p>
       <w:r>
-        <w:t>ПРИЛОЖЕНИЕ А (расшифровки интервью)</w:t>
-      </w:r>
-    </w:p>
-    <w:p>
-      <w:r>
-        <w:t>ПРИЛОЖЕНИЕ Б (wireframe-макеты)</w:t>
-      </w:r>
-    </w:p>
-    <w:p>
-      <w:r>
-        <w:t>ПРИЛОЖЕНИЕ В (листинги кода — опционально)</w:t>
+        <w:t>ЗАКЛЮЧЕНИЕ</w:t>
       </w:r>
     </w:p>
     <w:sectPr>

</xml_diff>